<commit_message>
auto ticket calssification using
</commit_message>
<xml_diff>
--- a/Auto_Ticket_Classification_Brainstorming_Idea_Generation.docx
+++ b/Auto_Ticket_Classification_Brainstorming_Idea_Generation.docx
@@ -158,7 +158,7 @@
                 <w:sz w:val="24"/>
                 <w:szCs w:val="24"/>
               </w:rPr>
-              <w:t>6ab699b2534c8646a9cdd6c7</w:t>
+              <w:t>SWTID-2026-6806</w:t>
             </w:r>
           </w:p>
         </w:tc>
@@ -325,15 +325,15 @@
           <w:szCs w:val="24"/>
         </w:rPr>
         <w:t>Selected Problem:</w:t>
+      </w:r>
+      <w:r>
+        <w:rPr>
+          <w:rFonts w:ascii="Lexend" w:eastAsia="Lexend" w:hAnsi="Lexend" w:cs="Lexend"/>
+          <w:sz w:val="24"/>
+          <w:szCs w:val="24"/>
+        </w:rPr>
         <w:br/>
         <w:t xml:space="preserve"> Tickets may be incorrectly classified or routed because classification is performed manually and relevant ticket information is not consistently evaluated.</w:t>
-      </w:r>
-      <w:r>
-        <w:rPr>
-          <w:rFonts w:ascii="Lexend" w:eastAsia="Lexend" w:hAnsi="Lexend" w:cs="Lexend"/>
-          <w:sz w:val="24"/>
-          <w:szCs w:val="24"/>
-        </w:rPr>
       </w:r>
     </w:p>
     <w:p>
@@ -846,6 +846,7 @@
                 <w:sz w:val="24"/>
                 <w:szCs w:val="24"/>
               </w:rPr>
+              <w:lastRenderedPageBreak/>
               <w:t>Save Validation</w:t>
             </w:r>
           </w:p>
@@ -921,7 +922,6 @@
                 <w:sz w:val="24"/>
                 <w:szCs w:val="24"/>
               </w:rPr>
-              <w:lastRenderedPageBreak/>
               <w:t>List Control</w:t>
             </w:r>
           </w:p>

</xml_diff>